<commit_message>
fix: ajusta extração de emitente em CCB
</commit_message>
<xml_diff>
--- a/novos_arquivos/templates/2) (Petição) EXECUÇÃO - ASSINATURA ELETRÔNICA - TEMPLATE.docx
+++ b/novos_arquivos/templates/2) (Petição) EXECUÇÃO - ASSINATURA ELETRÔNICA - TEMPLATE.docx
@@ -397,17 +397,19 @@
       </w:r>
       <w:r>
         <w:rPr>
-          <w:rFonts w:ascii="Tahoma" w:cs="Tahoma" w:eastAsia="Tahoma" w:hAnsi="Tahoma"/>
-          <w:color w:val="000000"/>
-          <w:rtl w:val="0"/>
-        </w:rPr>
-        <w:t xml:space="preserve"> {{qualificacao_empresa_executada}} e </w:t>
-      </w:r>
-      <w:r>
-        <w:rPr>
-          <w:rFonts w:ascii="Tahoma" w:cs="Tahoma" w:eastAsia="Tahoma" w:hAnsi="Tahoma"/>
           <w:b w:val="1"/>
           <w:bCs w:val="1"/>
+          <w:rFonts w:ascii="Tahoma" w:cs="Tahoma" w:eastAsia="Tahoma" w:hAnsi="Tahoma"/>
+          <w:color w:val="000000"/>
+          <w:rtl w:val="0"/>
+        </w:rPr>
+        <w:t xml:space="preserve"> {{qualificacao_empresa_executada}} e </w:t>
+      </w:r>
+      <w:r>
+        <w:rPr>
+          <w:rFonts w:ascii="Tahoma" w:cs="Tahoma" w:eastAsia="Tahoma" w:hAnsi="Tahoma"/>
+          <w:b w:val="1"/>
+          <w:bCs w:val="1"/>
           <w:color w:val="000000"/>
           <w:rtl w:val="0"/>
         </w:rPr>
@@ -415,6 +417,8 @@
       </w:r>
       <w:r>
         <w:rPr>
+          <w:b w:val="1"/>
+          <w:bCs w:val="1"/>
           <w:rFonts w:ascii="Tahoma" w:cs="Tahoma" w:eastAsia="Tahoma" w:hAnsi="Tahoma"/>
           <w:color w:val="000000"/>
           <w:rtl w:val="0"/>

</xml_diff>